<commit_message>
docs: README en inglés y saneo de las plantillas actualizadas
- README reescrito en inglés, sin nombrar ningún sistema interno
- verificar() del neutralizador ahora revisa docProps: antes daba OK a
  documentos que traían dc:creator y cp:lastModifiedBy con el nombre del
  autor, porque solo miraba texto e imágenes
- neutralizadas las plantillas de carta añadidas en esta iteración
- sustitución de la referencia a la jurisdicción en el cuerpo de una carta,
  para que el verificador quede sin hallazgos conocidos
</commit_message>
<xml_diff>
--- a/MACRO/RESOURCES/MODELOS_CARTA/Donaciones.docx
+++ b/MACRO/RESOURCES/MODELOS_CARTA/Donaciones.docx
@@ -1,6 +1,6 @@
 
 <file path=word/document.xml><?xml version="1.0" encoding="utf-8"?>
-<w:document xmlns:wpc="http://schemas.microsoft.com/office/word/2010/wordprocessingCanvas" xmlns:cx="http://schemas.microsoft.com/office/drawing/2014/chartex" xmlns:cx1="http://schemas.microsoft.com/office/drawing/2015/9/8/chartex" xmlns:cx2="http://schemas.microsoft.com/office/drawing/2015/10/21/chartex" xmlns:cx3="http://schemas.microsoft.com/office/drawing/2016/5/9/chartex" xmlns:cx4="http://schemas.microsoft.com/office/drawing/2016/5/10/chartex" xmlns:cx5="http://schemas.microsoft.com/office/drawing/2016/5/11/chartex" xmlns:cx6="http://schemas.microsoft.com/office/drawing/2016/5/12/chartex" xmlns:cx7="http://schemas.microsoft.com/office/drawing/2016/5/13/chartex" xmlns:cx8="http://schemas.microsoft.com/office/drawing/2016/5/14/chartex" xmlns:mc="http://schemas.openxmlformats.org/markup-compatibility/2006" xmlns:aink="http://schemas.microsoft.com/office/drawing/2016/ink" xmlns:am3d="http://schemas.microsoft.com/office/drawing/2017/model3d" xmlns:o="urn:schemas-microsoft-com:office:office" xmlns:oel="http://schemas.microsoft.com/office/2019/extlst" xmlns:r="http://schemas.openxmlformats.org/officeDocument/2006/relationships" xmlns:m="http://schemas.openxmlformats.org/officeDocument/2006/math" xmlns:v="urn:schemas-microsoft-com:vml" xmlns:wp14="http://schemas.microsoft.com/office/word/2010/wordprocessingDrawing" xmlns:wp="http://schemas.openxmlformats.org/drawingml/2006/wordprocessingDrawing" xmlns:w10="urn:schemas-microsoft-com:office:word" xmlns:w="http://schemas.openxmlformats.org/wordprocessingml/2006/main" xmlns:w14="http://schemas.microsoft.com/office/word/2010/wordml" xmlns:w15="http://schemas.microsoft.com/office/word/2012/wordml" xmlns:w16cex="http://schemas.microsoft.com/office/word/2018/wordml/cex" xmlns:w16cid="http://schemas.microsoft.com/office/word/2016/wordml/cid" xmlns:w16="http://schemas.microsoft.com/office/word/2018/wordml" xmlns:w16du="http://schemas.microsoft.com/office/word/2023/wordml/word16du" xmlns:w16sdtdh="http://schemas.microsoft.com/office/word/2020/wordml/sdtdatahash" xmlns:w16sdtfl="http://schemas.microsoft.com/office/word/2024/wordml/sdtformatlock" xmlns:w16se="http://schemas.microsoft.com/office/word/2015/wordml/symex" xmlns:wpg="http://schemas.microsoft.com/office/word/2010/wordprocessingGroup" xmlns:wpi="http://schemas.microsoft.com/office/word/2010/wordprocessingInk" xmlns:wne="http://schemas.microsoft.com/office/word/2006/wordml" xmlns:wps="http://schemas.microsoft.com/office/word/2010/wordprocessingShape" mc:Ignorable="w14 w15 w16se w16cid w16 w16cex w16sdtdh w16sdtfl w16du wp14">
+<w:document xmlns:wpc="http://schemas.microsoft.com/office/word/2010/wordprocessingCanvas" xmlns:cx="http://schemas.microsoft.com/office/drawing/2014/chartex" xmlns:cx1="http://schemas.microsoft.com/office/drawing/2015/9/8/chartex" xmlns:cx2="http://schemas.microsoft.com/office/drawing/2015/10/21/chartex" xmlns:cx3="http://schemas.microsoft.com/office/drawing/2016/5/9/chartex" xmlns:cx4="http://schemas.microsoft.com/office/drawing/2016/5/10/chartex" xmlns:cx5="http://schemas.microsoft.com/office/drawing/2016/5/11/chartex" xmlns:cx6="http://schemas.microsoft.com/office/drawing/2016/5/12/chartex" xmlns:cx7="http://schemas.microsoft.com/office/drawing/2016/5/13/chartex" xmlns:cx8="http://schemas.microsoft.com/office/drawing/2016/5/14/chartex" xmlns:mc="http://schemas.openxmlformats.org/markup-compatibility/2006" xmlns:aink="http://schemas.microsoft.com/office/drawing/2016/ink" xmlns:am3d="http://schemas.microsoft.com/office/drawing/2017/model3d" xmlns:o="urn:schemas-microsoft-com:office:office" xmlns:r="http://schemas.openxmlformats.org/officeDocument/2006/relationships" xmlns:m="http://schemas.openxmlformats.org/officeDocument/2006/math" xmlns:v="urn:schemas-microsoft-com:vml" xmlns:wp14="http://schemas.microsoft.com/office/word/2010/wordprocessingDrawing" xmlns:wp="http://schemas.openxmlformats.org/drawingml/2006/wordprocessingDrawing" xmlns:w10="urn:schemas-microsoft-com:office:word" xmlns:w="http://schemas.openxmlformats.org/wordprocessingml/2006/main" xmlns:w14="http://schemas.microsoft.com/office/word/2010/wordml" xmlns:w15="http://schemas.microsoft.com/office/word/2012/wordml" xmlns:w16cex="http://schemas.microsoft.com/office/word/2018/wordml/cex" xmlns:w16cid="http://schemas.microsoft.com/office/word/2016/wordml/cid" xmlns:w16="http://schemas.microsoft.com/office/word/2018/wordml" xmlns:w16sdtdh="http://schemas.microsoft.com/office/word/2020/wordml/sdtdatahash" xmlns:w16se="http://schemas.microsoft.com/office/word/2015/wordml/symex" xmlns:wpg="http://schemas.microsoft.com/office/word/2010/wordprocessingGroup" xmlns:wpi="http://schemas.microsoft.com/office/word/2010/wordprocessingInk" xmlns:wne="http://schemas.microsoft.com/office/word/2006/wordml" xmlns:wps="http://schemas.microsoft.com/office/word/2010/wordprocessingShape" mc:Ignorable="w14 w15 w16se w16cid w16 w16cex w16sdtdh wp14">
   <w:body>
     <w:p>
       <w:pPr>
@@ -61,9 +61,65 @@
           <w:szCs w:val="20"/>
           <w:lang w:val="es-ES_tradnl"/>
         </w:rPr>
-        <w:t xml:space="preserve">Presentar documentación que permita acreditar las donaciones efectuadas por el monto de S/{VAL_DON} según ha consignado en la Casilla 519 de su Declaración Jurada Anual PDT 709 </w:t>
-      </w:r>
-      <w:proofErr w:type="spellStart"/>
+        <w:t>Presentar documentación que permita acreditar las donaciones efectuadas por el monto de S/</w:t>
+      </w:r>
+      <w:r>
+        <w:rPr>
+          <w:rFonts w:ascii="Arial" w:hAnsi="Arial" w:cs="Arial"/>
+          <w:sz w:val="20"/>
+          <w:szCs w:val="20"/>
+        </w:rPr>
+        <w:fldChar w:fldCharType="begin"/>
+      </w:r>
+      <w:r>
+        <w:rPr>
+          <w:rFonts w:ascii="Arial" w:hAnsi="Arial" w:cs="Arial"/>
+          <w:sz w:val="20"/>
+          <w:szCs w:val="20"/>
+        </w:rPr>
+        <w:instrText xml:space="preserve"> MERGEFIELD </w:instrText>
+      </w:r>
+      <w:r>
+        <w:rPr>
+          <w:rFonts w:ascii="Arial" w:hAnsi="Arial" w:cs="Arial"/>
+          <w:sz w:val="20"/>
+          <w:szCs w:val="20"/>
+        </w:rPr>
+        <w:instrText>cas_519</w:instrText>
+      </w:r>
+      <w:r>
+        <w:rPr>
+          <w:rFonts w:ascii="Arial" w:hAnsi="Arial" w:cs="Arial"/>
+          <w:sz w:val="20"/>
+          <w:szCs w:val="20"/>
+        </w:rPr>
+        <w:instrText xml:space="preserve"> </w:instrText>
+      </w:r>
+      <w:r>
+        <w:rPr>
+          <w:rFonts w:ascii="Arial" w:hAnsi="Arial" w:cs="Arial"/>
+          <w:sz w:val="20"/>
+          <w:szCs w:val="20"/>
+        </w:rPr>
+        <w:fldChar w:fldCharType="separate"/>
+      </w:r>
+      <w:r>
+        <w:rPr>
+          <w:rFonts w:ascii="Arial" w:hAnsi="Arial" w:cs="Arial"/>
+          <w:noProof/>
+          <w:sz w:val="20"/>
+          <w:szCs w:val="20"/>
+        </w:rPr>
+        <w:t>«cas_519»</w:t>
+      </w:r>
+      <w:r>
+        <w:rPr>
+          <w:rFonts w:ascii="Arial" w:hAnsi="Arial" w:cs="Arial"/>
+          <w:sz w:val="20"/>
+          <w:szCs w:val="20"/>
+        </w:rPr>
+        <w:fldChar w:fldCharType="end"/>
+      </w:r>
       <w:r>
         <w:rPr>
           <w:rFonts w:ascii="Arial" w:hAnsi="Arial" w:cs="Arial"/>
@@ -72,18 +128,7 @@
           <w:szCs w:val="20"/>
           <w:lang w:val="es-ES_tradnl"/>
         </w:rPr>
-        <w:t>N°</w:t>
-      </w:r>
-      <w:proofErr w:type="spellEnd"/>
-      <w:r>
-        <w:rPr>
-          <w:rFonts w:ascii="Arial" w:hAnsi="Arial" w:cs="Arial"/>
-          <w:color w:val="000000"/>
-          <w:sz w:val="20"/>
-          <w:szCs w:val="20"/>
-          <w:lang w:val="es-ES_tradnl"/>
-        </w:rPr>
-        <w:t xml:space="preserve"> </w:t>
+        <w:t xml:space="preserve"> según ha consignado en la Casilla 519 de su Declaración Jurada Anual PDT 709 N° </w:t>
       </w:r>
       <w:r>
         <w:rPr>
@@ -276,9 +321,65 @@
           <w:szCs w:val="20"/>
           <w:lang w:val="es-ES_tradnl"/>
         </w:rPr>
-        <w:t xml:space="preserve">Indicar y presentar los medios de pago (transferencia, depósito en cuenta, cheque con la cláusula no negociable, entre otros) a través de los cuales se efectuaron las donaciones, de conformidad con lo establecido en la Ley </w:t>
-      </w:r>
-      <w:proofErr w:type="spellStart"/>
+        <w:t xml:space="preserve">Indicar y presentar los medios de pago (transferencia, depósito en cuenta, cheque con la cláusula no negociable, entre otros) a través de los cuales se efectuaron las donaciones, de conformidad con lo establecido en la Ley N° 28194 - Ley para la Lucha contra la Evasión y para la Formalización de la Economía y normas modificatorias, de corresponder. Si las aportaciones no requieren bancarización, adjuntar el estado de cuenta individual otorgado por la entidad receptora de donaciones donde se pueda visualizar el detalle de cada donación efectuada en el año </w:t>
+      </w:r>
+      <w:r>
+        <w:rPr>
+          <w:rFonts w:ascii="Arial" w:hAnsi="Arial" w:cs="Arial"/>
+          <w:sz w:val="20"/>
+          <w:szCs w:val="20"/>
+        </w:rPr>
+        <w:fldChar w:fldCharType="begin"/>
+      </w:r>
+      <w:r>
+        <w:rPr>
+          <w:rFonts w:ascii="Arial" w:hAnsi="Arial" w:cs="Arial"/>
+          <w:sz w:val="20"/>
+          <w:szCs w:val="20"/>
+        </w:rPr>
+        <w:instrText xml:space="preserve"> MERGEFIELD </w:instrText>
+      </w:r>
+      <w:r>
+        <w:rPr>
+          <w:rFonts w:ascii="Arial" w:hAnsi="Arial" w:cs="Arial"/>
+          <w:sz w:val="20"/>
+          <w:szCs w:val="20"/>
+        </w:rPr>
+        <w:instrText>anio</w:instrText>
+      </w:r>
+      <w:r>
+        <w:rPr>
+          <w:rFonts w:ascii="Arial" w:hAnsi="Arial" w:cs="Arial"/>
+          <w:sz w:val="20"/>
+          <w:szCs w:val="20"/>
+        </w:rPr>
+        <w:instrText xml:space="preserve"> </w:instrText>
+      </w:r>
+      <w:r>
+        <w:rPr>
+          <w:rFonts w:ascii="Arial" w:hAnsi="Arial" w:cs="Arial"/>
+          <w:sz w:val="20"/>
+          <w:szCs w:val="20"/>
+        </w:rPr>
+        <w:fldChar w:fldCharType="separate"/>
+      </w:r>
+      <w:r>
+        <w:rPr>
+          <w:rFonts w:ascii="Arial" w:hAnsi="Arial" w:cs="Arial"/>
+          <w:noProof/>
+          <w:sz w:val="20"/>
+          <w:szCs w:val="20"/>
+        </w:rPr>
+        <w:t>«anio»</w:t>
+      </w:r>
+      <w:r>
+        <w:rPr>
+          <w:rFonts w:ascii="Arial" w:hAnsi="Arial" w:cs="Arial"/>
+          <w:sz w:val="20"/>
+          <w:szCs w:val="20"/>
+        </w:rPr>
+        <w:fldChar w:fldCharType="end"/>
+      </w:r>
       <w:r>
         <w:rPr>
           <w:rFonts w:ascii="Arial" w:hAnsi="Arial" w:cs="Arial"/>
@@ -287,10 +388,14 @@
           <w:szCs w:val="20"/>
           <w:lang w:val="es-ES_tradnl"/>
         </w:rPr>
-        <w:t>N°</w:t>
-      </w:r>
-      <w:proofErr w:type="spellEnd"/>
-      <w:r>
+        <w:t>.</w:t>
+      </w:r>
+    </w:p>
+    <w:p>
+      <w:pPr>
+        <w:pStyle w:val="Prrafodelista"/>
+        <w:ind w:left="567"/>
+        <w:jc w:val="both"/>
         <w:rPr>
           <w:rFonts w:ascii="Arial" w:hAnsi="Arial" w:cs="Arial"/>
           <w:color w:val="000000"/>
@@ -298,75 +403,7 @@
           <w:szCs w:val="20"/>
           <w:lang w:val="es-ES_tradnl"/>
         </w:rPr>
-        <w:t xml:space="preserve"> 28194 - Ley para la Lucha contra la Evasión y para la Formalización de la Economía y normas modificatorias, de corresponder. Si las aportaciones no requieren bancarización, adjuntar el estado de cuenta individual otorgado por la entidad receptora de donaciones donde se pueda visualizar el detalle de cada donación efectuada en el año </w:t>
-      </w:r>
-      <w:r>
-        <w:rPr>
-          <w:rFonts w:ascii="Arial" w:hAnsi="Arial" w:cs="Arial"/>
-          <w:sz w:val="20"/>
-          <w:szCs w:val="20"/>
-        </w:rPr>
-        <w:fldChar w:fldCharType="begin"/>
-      </w:r>
-      <w:r>
-        <w:rPr>
-          <w:rFonts w:ascii="Arial" w:hAnsi="Arial" w:cs="Arial"/>
-          <w:sz w:val="20"/>
-          <w:szCs w:val="20"/>
-        </w:rPr>
-        <w:instrText xml:space="preserve"> MERGEFIELD </w:instrText>
-      </w:r>
-      <w:r>
-        <w:rPr>
-          <w:rFonts w:ascii="Arial" w:hAnsi="Arial" w:cs="Arial"/>
-          <w:sz w:val="20"/>
-          <w:szCs w:val="20"/>
-        </w:rPr>
-        <w:instrText>anio</w:instrText>
-      </w:r>
-      <w:r>
-        <w:rPr>
-          <w:rFonts w:ascii="Arial" w:hAnsi="Arial" w:cs="Arial"/>
-          <w:sz w:val="20"/>
-          <w:szCs w:val="20"/>
-        </w:rPr>
-        <w:instrText xml:space="preserve"> </w:instrText>
-      </w:r>
-      <w:r>
-        <w:rPr>
-          <w:rFonts w:ascii="Arial" w:hAnsi="Arial" w:cs="Arial"/>
-          <w:sz w:val="20"/>
-          <w:szCs w:val="20"/>
-        </w:rPr>
-        <w:fldChar w:fldCharType="separate"/>
-      </w:r>
-      <w:r>
-        <w:rPr>
-          <w:rFonts w:ascii="Arial" w:hAnsi="Arial" w:cs="Arial"/>
-          <w:noProof/>
-          <w:sz w:val="20"/>
-          <w:szCs w:val="20"/>
-        </w:rPr>
-        <w:t>«anio»</w:t>
-      </w:r>
-      <w:r>
-        <w:rPr>
-          <w:rFonts w:ascii="Arial" w:hAnsi="Arial" w:cs="Arial"/>
-          <w:sz w:val="20"/>
-          <w:szCs w:val="20"/>
-        </w:rPr>
-        <w:fldChar w:fldCharType="end"/>
-      </w:r>
-      <w:r>
-        <w:rPr>
-          <w:rFonts w:ascii="Arial" w:hAnsi="Arial" w:cs="Arial"/>
-          <w:color w:val="000000"/>
-          <w:sz w:val="20"/>
-          <w:szCs w:val="20"/>
-          <w:lang w:val="es-ES_tradnl"/>
-        </w:rPr>
-        <w:t>.</w:t>
-      </w:r>
+      </w:pPr>
     </w:p>
     <w:sectPr>
       <w:pgSz w:w="11906" w:h="16838"/>
@@ -379,7 +416,7 @@
 </file>
 
 <file path=word/numbering.xml><?xml version="1.0" encoding="utf-8"?>
-<w:numbering xmlns:wpc="http://schemas.microsoft.com/office/word/2010/wordprocessingCanvas" xmlns:cx="http://schemas.microsoft.com/office/drawing/2014/chartex" xmlns:cx1="http://schemas.microsoft.com/office/drawing/2015/9/8/chartex" xmlns:cx2="http://schemas.microsoft.com/office/drawing/2015/10/21/chartex" xmlns:cx3="http://schemas.microsoft.com/office/drawing/2016/5/9/chartex" xmlns:cx4="http://schemas.microsoft.com/office/drawing/2016/5/10/chartex" xmlns:cx5="http://schemas.microsoft.com/office/drawing/2016/5/11/chartex" xmlns:cx6="http://schemas.microsoft.com/office/drawing/2016/5/12/chartex" xmlns:cx7="http://schemas.microsoft.com/office/drawing/2016/5/13/chartex" xmlns:cx8="http://schemas.microsoft.com/office/drawing/2016/5/14/chartex" xmlns:mc="http://schemas.openxmlformats.org/markup-compatibility/2006" xmlns:aink="http://schemas.microsoft.com/office/drawing/2016/ink" xmlns:am3d="http://schemas.microsoft.com/office/drawing/2017/model3d" xmlns:o="urn:schemas-microsoft-com:office:office" xmlns:oel="http://schemas.microsoft.com/office/2019/extlst" xmlns:r="http://schemas.openxmlformats.org/officeDocument/2006/relationships" xmlns:m="http://schemas.openxmlformats.org/officeDocument/2006/math" xmlns:v="urn:schemas-microsoft-com:vml" xmlns:wp14="http://schemas.microsoft.com/office/word/2010/wordprocessingDrawing" xmlns:wp="http://schemas.openxmlformats.org/drawingml/2006/wordprocessingDrawing" xmlns:w10="urn:schemas-microsoft-com:office:word" xmlns:w="http://schemas.openxmlformats.org/wordprocessingml/2006/main" xmlns:w14="http://schemas.microsoft.com/office/word/2010/wordml" xmlns:w15="http://schemas.microsoft.com/office/word/2012/wordml" xmlns:w16cex="http://schemas.microsoft.com/office/word/2018/wordml/cex" xmlns:w16cid="http://schemas.microsoft.com/office/word/2016/wordml/cid" xmlns:w16="http://schemas.microsoft.com/office/word/2018/wordml" xmlns:w16du="http://schemas.microsoft.com/office/word/2023/wordml/word16du" xmlns:w16sdtdh="http://schemas.microsoft.com/office/word/2020/wordml/sdtdatahash" xmlns:w16sdtfl="http://schemas.microsoft.com/office/word/2024/wordml/sdtformatlock" xmlns:w16se="http://schemas.microsoft.com/office/word/2015/wordml/symex" xmlns:wpg="http://schemas.microsoft.com/office/word/2010/wordprocessingGroup" xmlns:wpi="http://schemas.microsoft.com/office/word/2010/wordprocessingInk" xmlns:wne="http://schemas.microsoft.com/office/word/2006/wordml" xmlns:wps="http://schemas.microsoft.com/office/word/2010/wordprocessingShape" mc:Ignorable="w14 w15 w16se w16cid w16 w16cex w16sdtdh w16sdtfl w16du wp14">
+<w:numbering xmlns:wpc="http://schemas.microsoft.com/office/word/2010/wordprocessingCanvas" xmlns:cx="http://schemas.microsoft.com/office/drawing/2014/chartex" xmlns:cx1="http://schemas.microsoft.com/office/drawing/2015/9/8/chartex" xmlns:cx2="http://schemas.microsoft.com/office/drawing/2015/10/21/chartex" xmlns:cx3="http://schemas.microsoft.com/office/drawing/2016/5/9/chartex" xmlns:cx4="http://schemas.microsoft.com/office/drawing/2016/5/10/chartex" xmlns:cx5="http://schemas.microsoft.com/office/drawing/2016/5/11/chartex" xmlns:cx6="http://schemas.microsoft.com/office/drawing/2016/5/12/chartex" xmlns:cx7="http://schemas.microsoft.com/office/drawing/2016/5/13/chartex" xmlns:cx8="http://schemas.microsoft.com/office/drawing/2016/5/14/chartex" xmlns:mc="http://schemas.openxmlformats.org/markup-compatibility/2006" xmlns:aink="http://schemas.microsoft.com/office/drawing/2016/ink" xmlns:am3d="http://schemas.microsoft.com/office/drawing/2017/model3d" xmlns:o="urn:schemas-microsoft-com:office:office" xmlns:r="http://schemas.openxmlformats.org/officeDocument/2006/relationships" xmlns:m="http://schemas.openxmlformats.org/officeDocument/2006/math" xmlns:v="urn:schemas-microsoft-com:vml" xmlns:wp14="http://schemas.microsoft.com/office/word/2010/wordprocessingDrawing" xmlns:wp="http://schemas.openxmlformats.org/drawingml/2006/wordprocessingDrawing" xmlns:w10="urn:schemas-microsoft-com:office:word" xmlns:w="http://schemas.openxmlformats.org/wordprocessingml/2006/main" xmlns:w14="http://schemas.microsoft.com/office/word/2010/wordml" xmlns:w15="http://schemas.microsoft.com/office/word/2012/wordml" xmlns:w16cex="http://schemas.microsoft.com/office/word/2018/wordml/cex" xmlns:w16cid="http://schemas.microsoft.com/office/word/2016/wordml/cid" xmlns:w16="http://schemas.microsoft.com/office/word/2018/wordml" xmlns:w16sdtdh="http://schemas.microsoft.com/office/word/2020/wordml/sdtdatahash" xmlns:w16se="http://schemas.microsoft.com/office/word/2015/wordml/symex" xmlns:wpg="http://schemas.microsoft.com/office/word/2010/wordprocessingGroup" xmlns:wpi="http://schemas.microsoft.com/office/word/2010/wordprocessingInk" xmlns:wne="http://schemas.microsoft.com/office/word/2006/wordml" xmlns:wps="http://schemas.microsoft.com/office/word/2010/wordprocessingShape" mc:Ignorable="w14 w15 w16se w16cid w16 w16cex w16sdtdh wp14">
   <w:abstractNum w:abstractNumId="0" w15:restartNumberingAfterBreak="0">
     <w:nsid w:val="244476A6"/>
     <w:multiLevelType w:val="multilevel"/>
@@ -558,17 +595,17 @@
       </w:pPr>
     </w:lvl>
   </w:abstractNum>
-  <w:num w:numId="1" w16cid:durableId="1195770490">
+  <w:num w:numId="1">
     <w:abstractNumId w:val="0"/>
   </w:num>
-  <w:num w:numId="2" w16cid:durableId="1271283694">
+  <w:num w:numId="2">
     <w:abstractNumId w:val="1"/>
   </w:num>
 </w:numbering>
 </file>
 
 <file path=word/styles.xml><?xml version="1.0" encoding="utf-8"?>
-<w:styles xmlns:mc="http://schemas.openxmlformats.org/markup-compatibility/2006" xmlns:r="http://schemas.openxmlformats.org/officeDocument/2006/relationships" xmlns:w="http://schemas.openxmlformats.org/wordprocessingml/2006/main" xmlns:w14="http://schemas.microsoft.com/office/word/2010/wordml" xmlns:w15="http://schemas.microsoft.com/office/word/2012/wordml" xmlns:w16cex="http://schemas.microsoft.com/office/word/2018/wordml/cex" xmlns:w16cid="http://schemas.microsoft.com/office/word/2016/wordml/cid" xmlns:w16="http://schemas.microsoft.com/office/word/2018/wordml" xmlns:w16du="http://schemas.microsoft.com/office/word/2023/wordml/word16du" xmlns:w16sdtdh="http://schemas.microsoft.com/office/word/2020/wordml/sdtdatahash" xmlns:w16sdtfl="http://schemas.microsoft.com/office/word/2024/wordml/sdtformatlock" xmlns:w16se="http://schemas.microsoft.com/office/word/2015/wordml/symex" mc:Ignorable="w14 w15 w16se w16cid w16 w16cex w16sdtdh w16sdtfl w16du">
+<w:styles xmlns:mc="http://schemas.openxmlformats.org/markup-compatibility/2006" xmlns:r="http://schemas.openxmlformats.org/officeDocument/2006/relationships" xmlns:w="http://schemas.openxmlformats.org/wordprocessingml/2006/main" xmlns:w14="http://schemas.microsoft.com/office/word/2010/wordml" xmlns:w15="http://schemas.microsoft.com/office/word/2012/wordml" xmlns:w16cex="http://schemas.microsoft.com/office/word/2018/wordml/cex" xmlns:w16cid="http://schemas.microsoft.com/office/word/2016/wordml/cid" xmlns:w16="http://schemas.microsoft.com/office/word/2018/wordml" xmlns:w16sdtdh="http://schemas.microsoft.com/office/word/2020/wordml/sdtdatahash" xmlns:w16se="http://schemas.microsoft.com/office/word/2015/wordml/symex" mc:Ignorable="w14 w15 w16se w16cid w16 w16cex w16sdtdh">
   <w:docDefaults>
     <w:rPrDefault>
       <w:rPr>

</xml_diff>